<commit_message>
fix: correct template 1.2 Inputs section order + always create artefacts table
Agent-Logs-Url: https://github.com/livesid44/iqflowagent/sessions/d10f89a4-0942-4c10-aaab-71f04862a9c7

Co-authored-by: livesid44 <169084330+livesid44@users.noreply.github.com>
</commit_message>
<xml_diff>
--- a/src/IQFlowAgent.Web/wwwroot/templates/BARTOK_DD_Template.docx
+++ b/src/IQFlowAgent.Web/wwwroot/templates/BARTOK_DD_Template.docx
@@ -2452,14 +2452,74 @@
     </w:p>
     <w:p>
       <w:pPr>
+        <w:pStyle w:val="Heading2"/>
+        <w:pBdr>
+          <w:bottom w:val="single" w:sz="6" w:space="0" w:color="5F0229"/>
+        </w:pBdr>
+        <w:spacing w:before="200" w:after="80"/>
+      </w:pPr>
+      <w:bookmarkStart w:id="5" w:name="_Toc223939104"/>
+      <w:r>
+        <w:rPr>
+          <w:bCs/>
+          <w:sz w:val="22"/>
+          <w:szCs w:val="22"/>
+        </w:rPr>
+        <w:t>1.2 Inputs &amp; Artefacts Received</w:t>
+      </w:r>
+      <w:bookmarkEnd w:id="5"/>
+    </w:p>
+    <w:p>
+      <w:pPr>
+        <w:spacing w:before="60" w:after="60"/>
+        <w:rPr>
+          <w:rFonts w:asciiTheme="minorHAnsi" w:hAnsiTheme="minorHAnsi"/>
+          <w:i/>
+          <w:iCs/>
+          <w:color w:val="BFBFBF" w:themeColor="background1" w:themeShade="BF"/>
+          <w:sz w:val="16"/>
+          <w:szCs w:val="16"/>
+        </w:rPr>
+      </w:pPr>
+      <w:r>
+        <w:rPr>
+          <w:rFonts w:asciiTheme="minorHAnsi" w:hAnsiTheme="minorHAnsi"/>
+          <w:i/>
+          <w:iCs/>
+          <w:color w:val="BFBFBF" w:themeColor="background1" w:themeShade="BF"/>
+          <w:sz w:val="16"/>
+          <w:szCs w:val="16"/>
+        </w:rPr>
+        <w:t>Log all documents, data files, and artefacts received from the client or shared internally before or during this DD session. Cross-reference these in the relevant sections below</w:t>
+      </w:r>
+    </w:p>
+    <w:p>
+      <w:pPr>
+        <w:spacing w:before="60" w:after="60"/>
+      </w:pPr>
+      <w:r>
+        <w:t xml:space="preserve">[All Document uploaded in task or Name of document, date when uploaded in a table] </w:t>
+      </w:r>
+    </w:p>
+    <w:p>
+      <w:pPr>
+        <w:spacing w:before="60" w:after="60"/>
+      </w:pPr>
+    </w:p>
+    <w:p>
+      <w:pPr>
         <w:pStyle w:val="Heading1"/>
-      </w:pPr>
-      <w:r>
-        <w:rPr>
-          <w:vanish/>
-        </w:rPr>
-        <w:t>2. Process Overview</w:t>
-      </w:r>
+        <w:shd w:val="clear" w:color="auto" w:fill="5F0229"/>
+        <w:spacing w:before="320" w:after="120"/>
+      </w:pPr>
+      <w:bookmarkStart w:id="6" w:name="_Toc223939105"/>
+      <w:r>
+        <w:rPr>
+          <w:bCs/>
+        </w:rPr>
+        <w:t xml:space="preserve">2. Process Overview </w:t>
+      </w:r>
+      <w:bookmarkEnd w:id="6"/>
     </w:p>
     <w:tbl>
       <w:tblPr>
@@ -2732,77 +2792,6 @@
         </w:tc>
       </w:tr>
     </w:tbl>
-    <w:p>
-      <w:pPr>
-        <w:pStyle w:val="Heading2"/>
-        <w:pBdr>
-          <w:bottom w:val="single" w:sz="6" w:space="0" w:color="5F0229"/>
-        </w:pBdr>
-        <w:spacing w:before="200" w:after="80"/>
-      </w:pPr>
-      <w:bookmarkStart w:id="5" w:name="_Toc223939104"/>
-      <w:r>
-        <w:rPr>
-          <w:bCs/>
-          <w:sz w:val="22"/>
-          <w:szCs w:val="22"/>
-        </w:rPr>
-        <w:t>1.2 Inputs &amp; Artefacts Received</w:t>
-      </w:r>
-      <w:bookmarkEnd w:id="5"/>
-    </w:p>
-    <w:p>
-      <w:pPr>
-        <w:spacing w:before="60" w:after="60"/>
-        <w:rPr>
-          <w:rFonts w:asciiTheme="minorHAnsi" w:hAnsiTheme="minorHAnsi"/>
-          <w:i/>
-          <w:iCs/>
-          <w:color w:val="BFBFBF" w:themeColor="background1" w:themeShade="BF"/>
-          <w:sz w:val="16"/>
-          <w:szCs w:val="16"/>
-        </w:rPr>
-      </w:pPr>
-      <w:r>
-        <w:rPr>
-          <w:rFonts w:asciiTheme="minorHAnsi" w:hAnsiTheme="minorHAnsi"/>
-          <w:i/>
-          <w:iCs/>
-          <w:color w:val="BFBFBF" w:themeColor="background1" w:themeShade="BF"/>
-          <w:sz w:val="16"/>
-          <w:szCs w:val="16"/>
-        </w:rPr>
-        <w:t>Log all documents, data files, and artefacts received from the client or shared internally before or during this DD session. Cross-reference these in the relevant sections below</w:t>
-      </w:r>
-    </w:p>
-    <w:p>
-      <w:pPr>
-        <w:spacing w:before="60" w:after="60"/>
-      </w:pPr>
-      <w:r>
-        <w:t xml:space="preserve">[All Document uploaded in task or Name of document, date when uploaded in a table] </w:t>
-      </w:r>
-    </w:p>
-    <w:p>
-      <w:pPr>
-        <w:spacing w:before="60" w:after="60"/>
-      </w:pPr>
-    </w:p>
-    <w:p>
-      <w:pPr>
-        <w:pStyle w:val="Heading1"/>
-        <w:shd w:val="clear" w:color="auto" w:fill="5F0229"/>
-        <w:spacing w:before="320" w:after="120"/>
-      </w:pPr>
-      <w:bookmarkStart w:id="6" w:name="_Toc223939105"/>
-      <w:r>
-        <w:rPr>
-          <w:bCs/>
-        </w:rPr>
-        <w:t xml:space="preserve">2. Process Overview </w:t>
-      </w:r>
-      <w:bookmarkEnd w:id="6"/>
-    </w:p>
     <w:tbl>
       <w:tblPr>
         <w:tblW w:w="9746" w:type="dxa"/>

</xml_diff>